<commit_message>
Add portfolio QR code to resume
</commit_message>
<xml_diff>
--- a/portfolio/肖振_个人简历.docx
+++ b/portfolio/肖振_个人简历.docx
@@ -23,152 +23,59 @@
           <w:color w:val="000000"/>
           <w:sz w:val="52"/>
         </w:rPr>
-        <mc:AlternateContent>
-          <mc:Choice Requires="wps">
-            <w:drawing>
-              <wp:anchor distT="0" distB="0" distL="114300" distR="114300" simplePos="0" relativeHeight="251659264" behindDoc="0" locked="0" layoutInCell="1" allowOverlap="1" wp14:anchorId="450CBAF7" wp14:editId="0E79281A">
-                <wp:simplePos x="0" y="0"/>
-                <wp:positionH relativeFrom="page">
-                  <wp:posOffset>5153660</wp:posOffset>
-                </wp:positionH>
-                <wp:positionV relativeFrom="page">
-                  <wp:posOffset>609600</wp:posOffset>
-                </wp:positionV>
-                <wp:extent cx="850900" cy="850900"/>
-                <wp:effectExtent l="0" t="0" r="25400" b="25400"/>
-                <wp:wrapNone/>
-                <wp:docPr id="2115528911" name="文本框 2" descr="作品集二维码预留位置；尚未绑定链接，不可扫描"/>
-                <wp:cNvGraphicFramePr/>
-                <a:graphic xmlns:a="http://schemas.openxmlformats.org/drawingml/2006/main">
-                  <a:graphicData uri="http://schemas.microsoft.com/office/word/2010/wordprocessingShape">
-                    <wps:wsp>
-                      <wps:cNvSpPr txBox="1"/>
-                      <wps:spPr>
-                        <a:xfrm>
-                          <a:off x="0" y="0"/>
-                          <a:ext cx="850900" cy="850900"/>
-                        </a:xfrm>
-                        <a:prstGeom prst="rect">
-                          <a:avLst/>
-                        </a:prstGeom>
-                        <a:noFill/>
-                        <a:ln w="9525">
-                          <a:solidFill>
-                            <a:srgbClr val="C0C0C0"/>
-                          </a:solidFill>
-                          <a:prstDash val="dash"/>
-                        </a:ln>
-                      </wps:spPr>
-                      <wps:txbx>
-                        <w:txbxContent>
-                          <w:p>
-                            <w:pPr>
-                              <w:spacing w:after="0" w:line="240" w:lineRule="auto"/>
-                              <w:jc w:val="center"/>
-                              <w:rPr>
-                                <w:rFonts w:ascii="微软雅黑" w:eastAsia="微软雅黑" w:hAnsi="微软雅黑" w:hint="eastAsia"/>
-                                <w:color w:val="555555"/>
-                                <w:sz w:val="18"/>
-                              </w:rPr>
-                            </w:pPr>
-                            <w:r>
-                              <w:rPr>
-                                <w:rFonts w:ascii="微软雅黑" w:eastAsia="微软雅黑" w:hAnsi="微软雅黑" w:hint="eastAsia"/>
-                                <w:color w:val="555555"/>
-                                <w:sz w:val="18"/>
-                              </w:rPr>
-                              <w:t>作品集</w:t>
-                            </w:r>
-                          </w:p>
-                          <w:p>
-                            <w:pPr>
-                              <w:spacing w:after="0" w:line="240" w:lineRule="auto"/>
-                              <w:jc w:val="center"/>
-                              <w:rPr>
-                                <w:rFonts w:ascii="微软雅黑" w:eastAsia="微软雅黑" w:hAnsi="微软雅黑"/>
-                                <w:color w:val="555555"/>
-                                <w:sz w:val="18"/>
-                              </w:rPr>
-                            </w:pPr>
-                            <w:r>
-                              <w:rPr>
-                                <w:rFonts w:ascii="微软雅黑" w:eastAsia="微软雅黑" w:hAnsi="微软雅黑" w:hint="eastAsia"/>
-                                <w:color w:val="555555"/>
-                                <w:sz w:val="18"/>
-                              </w:rPr>
-                              <w:t>二维码位</w:t>
-                            </w:r>
-                          </w:p>
-                        </w:txbxContent>
-                      </wps:txbx>
-                      <wps:bodyPr rot="0" spcFirstLastPara="0" vertOverflow="overflow" horzOverflow="overflow" vert="horz" wrap="square" lIns="38100" tIns="63500" rIns="38100" bIns="63500" numCol="1" spcCol="0" rtlCol="0" fromWordArt="0" anchor="ctr" anchorCtr="0" forceAA="0" compatLnSpc="1">
-                        <a:prstTxWarp prst="textNoShape">
-                          <a:avLst/>
-                        </a:prstTxWarp>
-                        <a:noAutofit/>
-                      </wps:bodyPr>
-                    </wps:wsp>
-                  </a:graphicData>
-                </a:graphic>
-              </wp:anchor>
-            </w:drawing>
-          </mc:Choice>
-          <mc:Fallback>
-            <w:pict>
-              <v:shapetype w14:anchorId="450CBAF7" id="_x0000_t202" coordsize="21600,21600" o:spt="202" path="m,l,21600r21600,l21600,xe">
-                <v:stroke joinstyle="miter"/>
-                <v:path gradientshapeok="t" o:connecttype="rect"/>
-              </v:shapetype>
-              <v:shape id="文本框 2" o:spid="_x0000_s1026" type="#_x0000_t202" alt="作品集二维码预留位置；尚未绑定链接，不可扫描" style="position:absolute;margin-left:405.8pt;margin-top:48pt;width:67pt;height:67pt;z-index:251659264;visibility:visible;mso-wrap-style:square;mso-wrap-distance-left:9pt;mso-wrap-distance-top:0;mso-wrap-distance-right:9pt;mso-wrap-distance-bottom:0;mso-position-horizontal:absolute;mso-position-horizontal-relative:page;mso-position-vertical:absolute;mso-position-vertical-relative:page;v-text-anchor:middle" o:gfxdata="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" filled="f" strokecolor="silver">
-                <v:fill o:detectmouseclick="t"/>
-                <v:stroke dashstyle="dash"/>
-                <v:textbox inset="3pt,5pt,3pt,5pt">
-                  <w:txbxContent>
-                    <w:p>
-                      <w:pPr>
-                        <w:spacing w:after="0" w:line="240" w:lineRule="auto"/>
-                        <w:jc w:val="center"/>
-                        <w:rPr>
-                          <w:rFonts w:ascii="微软雅黑" w:eastAsia="微软雅黑" w:hAnsi="微软雅黑" w:hint="eastAsia"/>
-                          <w:color w:val="555555"/>
-                          <w:sz w:val="18"/>
-                        </w:rPr>
-                      </w:pPr>
-                      <w:r>
-                        <w:rPr>
-                          <w:rFonts w:ascii="微软雅黑" w:eastAsia="微软雅黑" w:hAnsi="微软雅黑" w:hint="eastAsia"/>
-                          <w:color w:val="555555"/>
-                          <w:sz w:val="18"/>
-                        </w:rPr>
-                        <w:t>作品集</w:t>
-                      </w:r>
-                    </w:p>
-                    <w:p>
-                      <w:pPr>
-                        <w:spacing w:after="0" w:line="240" w:lineRule="auto"/>
-                        <w:jc w:val="center"/>
-                        <w:rPr>
-                          <w:rFonts w:ascii="微软雅黑" w:eastAsia="微软雅黑" w:hAnsi="微软雅黑"/>
-                          <w:color w:val="555555"/>
-                          <w:sz w:val="18"/>
-                        </w:rPr>
-                      </w:pPr>
-                      <w:r>
-                        <w:rPr>
-                          <w:rFonts w:ascii="微软雅黑" w:eastAsia="微软雅黑" w:hAnsi="微软雅黑" w:hint="eastAsia"/>
-                          <w:color w:val="555555"/>
-                          <w:sz w:val="18"/>
-                        </w:rPr>
-                        <w:t>二维码位</w:t>
-                      </w:r>
-                    </w:p>
-                  </w:txbxContent>
-                </v:textbox>
-                <w10:wrap anchorx="page" anchory="page"/>
-              </v:shape>
-            </w:pict>
-          </mc:Fallback>
-        </mc:AlternateContent>
+        <w:drawing>
+          <wp:anchor distT="0" distB="0" distL="114300" distR="114300" simplePos="1" relativeHeight="251659264" behindDoc="0" locked="0" layoutInCell="1" allowOverlap="1" wp14:anchorId="22EC219B" wp14:editId="7E078655">
+            <wp:simplePos x="5153660" y="609600"/>
+            <wp:positionH relativeFrom="page">
+              <wp:posOffset>5153660</wp:posOffset>
+            </wp:positionH>
+            <wp:positionV relativeFrom="page">
+              <wp:posOffset>609600</wp:posOffset>
+            </wp:positionV>
+            <wp:extent cx="850900" cy="850900"/>
+            <wp:effectExtent l="0" t="0" r="6350" b="6350"/>
+            <wp:wrapNone/>
+            <wp:docPr id="493912038" name="图片 2"/>
+            <wp:cNvGraphicFramePr/>
+            <a:graphic xmlns:a="http://schemas.openxmlformats.org/drawingml/2006/main">
+              <a:graphicData uri="http://schemas.openxmlformats.org/drawingml/2006/picture">
+                <pic:pic xmlns:pic="http://schemas.openxmlformats.org/drawingml/2006/picture">
+                  <pic:nvPicPr>
+                    <pic:cNvPr id="493912038" name=""/>
+                    <pic:cNvPicPr/>
+                  </pic:nvPicPr>
+                  <pic:blipFill>
+                    <a:blip r:embed="rId7" cstate="print">
+                      <a:extLst>
+                        <a:ext uri="{28A0092B-C50C-407E-A947-70E740481C1C}">
+                          <a14:useLocalDpi xmlns:a14="http://schemas.microsoft.com/office/drawing/2010/main" val="0"/>
+                        </a:ext>
+                      </a:extLst>
+                    </a:blip>
+                    <a:stretch>
+                      <a:fillRect/>
+                    </a:stretch>
+                  </pic:blipFill>
+                  <pic:spPr>
+                    <a:xfrm>
+                      <a:off x="0" y="0"/>
+                      <a:ext cx="850900" cy="850900"/>
+                    </a:xfrm>
+                    <a:prstGeom prst="rect">
+                      <a:avLst/>
+                    </a:prstGeom>
+                  </pic:spPr>
+                </pic:pic>
+              </a:graphicData>
+            </a:graphic>
+            <wp14:sizeRelH relativeFrom="margin">
+              <wp14:pctWidth>0</wp14:pctWidth>
+            </wp14:sizeRelH>
+            <wp14:sizeRelV relativeFrom="margin">
+              <wp14:pctHeight>0</wp14:pctHeight>
+            </wp14:sizeRelV>
+          </wp:anchor>
+        </w:drawing>
       </w:r>
       <w:r>
         <w:rPr>
@@ -179,7 +86,7 @@
           <w:sz w:val="52"/>
         </w:rPr>
         <w:drawing>
-          <wp:anchor distT="0" distB="0" distL="114300" distR="114300" simplePos="0" relativeHeight="251658240" behindDoc="0" locked="0" layoutInCell="1" allowOverlap="1" wp14:anchorId="6EE15E68" wp14:editId="59043886">
+          <wp:anchor distT="0" distB="0" distL="114300" distR="114300" simplePos="0" relativeHeight="251658240" behindDoc="0" locked="0" layoutInCell="1" allowOverlap="1" wp14:anchorId="6EE15E68" wp14:editId="01B95ECC">
             <wp:simplePos x="0" y="0"/>
             <wp:positionH relativeFrom="page">
               <wp:posOffset>6258560</wp:posOffset>
@@ -200,7 +107,7 @@
                     <pic:cNvPicPr/>
                   </pic:nvPicPr>
                   <pic:blipFill>
-                    <a:blip r:embed="rId5" cstate="print">
+                    <a:blip r:embed="rId8" cstate="print">
                       <a:extLst>
                         <a:ext uri="{28A0092B-C50C-407E-A947-70E740481C1C}">
                           <a14:useLocalDpi xmlns:a14="http://schemas.microsoft.com/office/drawing/2010/main" val="0"/>
@@ -1106,7 +1013,7 @@
         <w:snapToGrid w:val="0"/>
         <w:spacing w:after="60" w:line="310" w:lineRule="exact"/>
         <w:rPr>
-          <w:rFonts w:ascii="微软雅黑" w:eastAsia="微软雅黑" w:hAnsi="微软雅黑"/>
+          <w:rFonts w:ascii="微软雅黑" w:eastAsia="微软雅黑" w:hAnsi="微软雅黑" w:hint="eastAsia"/>
           <w:color w:val="000000"/>
           <w:sz w:val="21"/>
         </w:rPr>
@@ -1120,6 +1027,68 @@
     </w:sectPr>
   </w:body>
 </w:document>
+</file>
+
+<file path=word/endnotes.xml><?xml version="1.0" encoding="utf-8"?>
+<w:endnotes xmlns:wpc="http://schemas.microsoft.com/office/word/2010/wordprocessingCanvas" xmlns:cx="http://schemas.microsoft.com/office/drawing/2014/chartex" xmlns:cx1="http://schemas.microsoft.com/office/drawing/2015/9/8/chartex" xmlns:cx2="http://schemas.microsoft.com/office/drawing/2015/10/21/chartex" xmlns:cx3="http://schemas.microsoft.com/office/drawing/2016/5/9/chartex" xmlns:cx4="http://schemas.microsoft.com/office/drawing/2016/5/10/chartex" xmlns:cx5="http://schemas.microsoft.com/office/drawing/2016/5/11/chartex" xmlns:cx6="http://schemas.microsoft.com/office/drawing/2016/5/12/chartex" xmlns:cx7="http://schemas.microsoft.com/office/drawing/2016/5/13/chartex" xmlns:cx8="http://schemas.microsoft.com/office/drawing/2016/5/14/chartex" xmlns:mc="http://schemas.openxmlformats.org/markup-compatibility/2006" xmlns:aink="http://schemas.microsoft.com/office/drawing/2016/ink" xmlns:am3d="http://schemas.microsoft.com/office/drawing/2017/model3d" xmlns:o="urn:schemas-microsoft-com:office:office" xmlns:oel="http://schemas.microsoft.com/office/2019/extlst" xmlns:r="http://schemas.openxmlformats.org/officeDocument/2006/relationships" xmlns:m="http://schemas.openxmlformats.org/officeDocument/2006/math" xmlns:v="urn:schemas-microsoft-com:vml" xmlns:wp14="http://schemas.microsoft.com/office/word/2010/wordprocessingDrawing" xmlns:wp="http://schemas.openxmlformats.org/drawingml/2006/wordprocessingDrawing" xmlns:w10="urn:schemas-microsoft-com:office:word" xmlns:w="http://schemas.openxmlformats.org/wordprocessingml/2006/main" xmlns:w14="http://schemas.microsoft.com/office/word/2010/wordml" xmlns:w15="http://schemas.microsoft.com/office/word/2012/wordml" xmlns:w16cex="http://schemas.microsoft.com/office/word/2018/wordml/cex" xmlns:w16cid="http://schemas.microsoft.com/office/word/2016/wordml/cid" xmlns:w16="http://schemas.microsoft.com/office/word/2018/wordml" xmlns:w16du="http://schemas.microsoft.com/office/word/2023/wordml/word16du" xmlns:w16sdtdh="http://schemas.microsoft.com/office/word/2020/wordml/sdtdatahash" xmlns:w16sdtfl="http://schemas.microsoft.com/office/word/2024/wordml/sdtformatlock" xmlns:w16se="http://schemas.microsoft.com/office/word/2015/wordml/symex" xmlns:wpg="http://schemas.microsoft.com/office/word/2010/wordprocessingGroup" xmlns:wpi="http://schemas.microsoft.com/office/word/2010/wordprocessingInk" xmlns:wne="http://schemas.microsoft.com/office/word/2006/wordml" xmlns:wps="http://schemas.microsoft.com/office/word/2010/wordprocessingShape" mc:Ignorable="w14 w15 w16se w16cid w16 w16cex w16sdtdh w16sdtfl w16du wp14">
+  <w:endnote w:type="separator" w:id="-1">
+    <w:p>
+      <w:pPr>
+        <w:spacing w:after="0" w:line="240" w:lineRule="auto"/>
+        <w:rPr>
+          <w:rFonts w:hint="eastAsia"/>
+        </w:rPr>
+      </w:pPr>
+      <w:r>
+        <w:separator/>
+      </w:r>
+    </w:p>
+  </w:endnote>
+  <w:endnote w:type="continuationSeparator" w:id="0">
+    <w:p>
+      <w:pPr>
+        <w:spacing w:after="0" w:line="240" w:lineRule="auto"/>
+        <w:rPr>
+          <w:rFonts w:hint="eastAsia"/>
+        </w:rPr>
+      </w:pPr>
+      <w:r>
+        <w:continuationSeparator/>
+      </w:r>
+    </w:p>
+  </w:endnote>
+</w:endnotes>
+</file>
+
+<file path=word/footnotes.xml><?xml version="1.0" encoding="utf-8"?>
+<w:footnotes xmlns:wpc="http://schemas.microsoft.com/office/word/2010/wordprocessingCanvas" xmlns:cx="http://schemas.microsoft.com/office/drawing/2014/chartex" xmlns:cx1="http://schemas.microsoft.com/office/drawing/2015/9/8/chartex" xmlns:cx2="http://schemas.microsoft.com/office/drawing/2015/10/21/chartex" xmlns:cx3="http://schemas.microsoft.com/office/drawing/2016/5/9/chartex" xmlns:cx4="http://schemas.microsoft.com/office/drawing/2016/5/10/chartex" xmlns:cx5="http://schemas.microsoft.com/office/drawing/2016/5/11/chartex" xmlns:cx6="http://schemas.microsoft.com/office/drawing/2016/5/12/chartex" xmlns:cx7="http://schemas.microsoft.com/office/drawing/2016/5/13/chartex" xmlns:cx8="http://schemas.microsoft.com/office/drawing/2016/5/14/chartex" xmlns:mc="http://schemas.openxmlformats.org/markup-compatibility/2006" xmlns:aink="http://schemas.microsoft.com/office/drawing/2016/ink" xmlns:am3d="http://schemas.microsoft.com/office/drawing/2017/model3d" xmlns:o="urn:schemas-microsoft-com:office:office" xmlns:oel="http://schemas.microsoft.com/office/2019/extlst" xmlns:r="http://schemas.openxmlformats.org/officeDocument/2006/relationships" xmlns:m="http://schemas.openxmlformats.org/officeDocument/2006/math" xmlns:v="urn:schemas-microsoft-com:vml" xmlns:wp14="http://schemas.microsoft.com/office/word/2010/wordprocessingDrawing" xmlns:wp="http://schemas.openxmlformats.org/drawingml/2006/wordprocessingDrawing" xmlns:w10="urn:schemas-microsoft-com:office:word" xmlns:w="http://schemas.openxmlformats.org/wordprocessingml/2006/main" xmlns:w14="http://schemas.microsoft.com/office/word/2010/wordml" xmlns:w15="http://schemas.microsoft.com/office/word/2012/wordml" xmlns:w16cex="http://schemas.microsoft.com/office/word/2018/wordml/cex" xmlns:w16cid="http://schemas.microsoft.com/office/word/2016/wordml/cid" xmlns:w16="http://schemas.microsoft.com/office/word/2018/wordml" xmlns:w16du="http://schemas.microsoft.com/office/word/2023/wordml/word16du" xmlns:w16sdtdh="http://schemas.microsoft.com/office/word/2020/wordml/sdtdatahash" xmlns:w16sdtfl="http://schemas.microsoft.com/office/word/2024/wordml/sdtformatlock" xmlns:w16se="http://schemas.microsoft.com/office/word/2015/wordml/symex" xmlns:wpg="http://schemas.microsoft.com/office/word/2010/wordprocessingGroup" xmlns:wpi="http://schemas.microsoft.com/office/word/2010/wordprocessingInk" xmlns:wne="http://schemas.microsoft.com/office/word/2006/wordml" xmlns:wps="http://schemas.microsoft.com/office/word/2010/wordprocessingShape" mc:Ignorable="w14 w15 w16se w16cid w16 w16cex w16sdtdh w16sdtfl w16du wp14">
+  <w:footnote w:type="separator" w:id="-1">
+    <w:p>
+      <w:pPr>
+        <w:spacing w:after="0" w:line="240" w:lineRule="auto"/>
+        <w:rPr>
+          <w:rFonts w:hint="eastAsia"/>
+        </w:rPr>
+      </w:pPr>
+      <w:r>
+        <w:separator/>
+      </w:r>
+    </w:p>
+  </w:footnote>
+  <w:footnote w:type="continuationSeparator" w:id="0">
+    <w:p>
+      <w:pPr>
+        <w:spacing w:after="0" w:line="240" w:lineRule="auto"/>
+        <w:rPr>
+          <w:rFonts w:hint="eastAsia"/>
+        </w:rPr>
+      </w:pPr>
+      <w:r>
+        <w:continuationSeparator/>
+      </w:r>
+    </w:p>
+  </w:footnote>
+</w:footnotes>
 </file>
 
 <file path=word/numbering.xml><?xml version="1.0" encoding="utf-8"?>
@@ -2091,6 +2060,69 @@
       <w:spacing w:val="5"/>
     </w:rPr>
   </w:style>
+  <w:style w:type="paragraph" w:styleId="ae">
+    <w:name w:val="header"/>
+    <w:basedOn w:val="a"/>
+    <w:link w:val="af"/>
+    <w:uiPriority w:val="99"/>
+    <w:unhideWhenUsed/>
+    <w:rsid w:val="001D61A5"/>
+    <w:pPr>
+      <w:tabs>
+        <w:tab w:val="center" w:pos="4153"/>
+        <w:tab w:val="right" w:pos="8306"/>
+      </w:tabs>
+      <w:snapToGrid w:val="0"/>
+      <w:spacing w:line="240" w:lineRule="auto"/>
+      <w:jc w:val="center"/>
+    </w:pPr>
+    <w:rPr>
+      <w:sz w:val="18"/>
+      <w:szCs w:val="18"/>
+    </w:rPr>
+  </w:style>
+  <w:style w:type="character" w:customStyle="1" w:styleId="af">
+    <w:name w:val="页眉 字符"/>
+    <w:basedOn w:val="a0"/>
+    <w:link w:val="ae"/>
+    <w:uiPriority w:val="99"/>
+    <w:rsid w:val="001D61A5"/>
+    <w:rPr>
+      <w:sz w:val="18"/>
+      <w:szCs w:val="18"/>
+    </w:rPr>
+  </w:style>
+  <w:style w:type="paragraph" w:styleId="af0">
+    <w:name w:val="footer"/>
+    <w:basedOn w:val="a"/>
+    <w:link w:val="af1"/>
+    <w:uiPriority w:val="99"/>
+    <w:unhideWhenUsed/>
+    <w:rsid w:val="001D61A5"/>
+    <w:pPr>
+      <w:tabs>
+        <w:tab w:val="center" w:pos="4153"/>
+        <w:tab w:val="right" w:pos="8306"/>
+      </w:tabs>
+      <w:snapToGrid w:val="0"/>
+      <w:spacing w:line="240" w:lineRule="auto"/>
+    </w:pPr>
+    <w:rPr>
+      <w:sz w:val="18"/>
+      <w:szCs w:val="18"/>
+    </w:rPr>
+  </w:style>
+  <w:style w:type="character" w:customStyle="1" w:styleId="af1">
+    <w:name w:val="页脚 字符"/>
+    <w:basedOn w:val="a0"/>
+    <w:link w:val="af0"/>
+    <w:uiPriority w:val="99"/>
+    <w:rsid w:val="001D61A5"/>
+    <w:rPr>
+      <w:sz w:val="18"/>
+      <w:szCs w:val="18"/>
+    </w:rPr>
+  </w:style>
 </w:styles>
 </file>
 

</xml_diff>